<commit_message>
docs: Semanas 7, 8 e 9
</commit_message>
<xml_diff>
--- a/docs/Cronograma de Desenvolvimento.docx
+++ b/docs/Cronograma de Desenvolvimento.docx
@@ -549,21 +549,8 @@
         </w:numPr>
       </w:pPr>
       <w:r>
-        <w:t xml:space="preserve">Estrutura base do projeto em </w:t>
-      </w:r>
-      <w:proofErr w:type="spellStart"/>
-      <w:r>
-        <w:t>React</w:t>
-      </w:r>
-      <w:proofErr w:type="spellEnd"/>
-      <w:r>
-        <w:t xml:space="preserve"> com </w:t>
-      </w:r>
-      <w:proofErr w:type="spellStart"/>
-      <w:r>
-        <w:t>TypeScript</w:t>
-      </w:r>
-      <w:proofErr w:type="spellEnd"/>
+        <w:t>Estrutura base do projeto em React com TypeScript</w:t>
+      </w:r>
     </w:p>
     <w:p>
       <w:pPr>
@@ -600,6 +587,17 @@
     </w:p>
     <w:p>
       <w:pPr>
+        <w:numPr>
+          <w:ilvl w:val="0"/>
+          <w:numId w:val="2"/>
+        </w:numPr>
+      </w:pPr>
+      <w:r>
+        <w:t>Integração inicial entre frontend e backend</w:t>
+      </w:r>
+    </w:p>
+    <w:p>
+      <w:pPr>
         <w:pStyle w:val="Ttulo2"/>
       </w:pPr>
       <w:r>
@@ -610,7 +608,18 @@
       <w:pPr>
         <w:numPr>
           <w:ilvl w:val="0"/>
-          <w:numId w:val="3"/>
+          <w:numId w:val="2"/>
+        </w:numPr>
+      </w:pPr>
+      <w:r>
+        <w:t>Implementação do módulo de usuários</w:t>
+      </w:r>
+    </w:p>
+    <w:p>
+      <w:pPr>
+        <w:numPr>
+          <w:ilvl w:val="0"/>
+          <w:numId w:val="2"/>
         </w:numPr>
       </w:pPr>
       <w:r>
@@ -621,7 +630,7 @@
       <w:pPr>
         <w:numPr>
           <w:ilvl w:val="0"/>
-          <w:numId w:val="3"/>
+          <w:numId w:val="2"/>
         </w:numPr>
       </w:pPr>
       <w:r>
@@ -632,7 +641,7 @@
       <w:pPr>
         <w:numPr>
           <w:ilvl w:val="0"/>
-          <w:numId w:val="3"/>
+          <w:numId w:val="2"/>
         </w:numPr>
       </w:pPr>
       <w:r>
@@ -651,33 +660,44 @@
       <w:pPr>
         <w:numPr>
           <w:ilvl w:val="0"/>
-          <w:numId w:val="4"/>
-        </w:numPr>
-      </w:pPr>
-      <w:r>
-        <w:t>Integração com API externa para busca de livros</w:t>
-      </w:r>
-    </w:p>
-    <w:p>
-      <w:pPr>
-        <w:numPr>
-          <w:ilvl w:val="0"/>
-          <w:numId w:val="4"/>
-        </w:numPr>
-      </w:pPr>
-      <w:r>
-        <w:t>Implementação da funcionalidade “Livro do mês”</w:t>
-      </w:r>
-    </w:p>
-    <w:p>
-      <w:pPr>
-        <w:numPr>
-          <w:ilvl w:val="0"/>
-          <w:numId w:val="4"/>
-        </w:numPr>
-      </w:pPr>
-      <w:r>
-        <w:t>Estruturação do histórico de leituras</w:t>
+          <w:numId w:val="2"/>
+        </w:numPr>
+      </w:pPr>
+      <w:r>
+        <w:t>Implementação do módulo de Livros</w:t>
+      </w:r>
+    </w:p>
+    <w:p>
+      <w:pPr>
+        <w:numPr>
+          <w:ilvl w:val="0"/>
+          <w:numId w:val="2"/>
+        </w:numPr>
+      </w:pPr>
+      <w:r>
+        <w:t>Cadastro e listagem de livros por clube</w:t>
+      </w:r>
+    </w:p>
+    <w:p>
+      <w:pPr>
+        <w:numPr>
+          <w:ilvl w:val="0"/>
+          <w:numId w:val="2"/>
+        </w:numPr>
+      </w:pPr>
+      <w:r>
+        <w:t>Implementação da funcionalidade de histórico de leituras</w:t>
+      </w:r>
+    </w:p>
+    <w:p>
+      <w:pPr>
+        <w:numPr>
+          <w:ilvl w:val="0"/>
+          <w:numId w:val="2"/>
+        </w:numPr>
+      </w:pPr>
+      <w:r>
+        <w:t>Ajustes de navegação entre clubes e livros</w:t>
       </w:r>
     </w:p>
     <w:p>
@@ -692,33 +712,44 @@
       <w:pPr>
         <w:numPr>
           <w:ilvl w:val="0"/>
-          <w:numId w:val="5"/>
-        </w:numPr>
-      </w:pPr>
-      <w:r>
-        <w:t>Implementação de discussões por capítulo</w:t>
-      </w:r>
-    </w:p>
-    <w:p>
-      <w:pPr>
-        <w:numPr>
-          <w:ilvl w:val="0"/>
-          <w:numId w:val="5"/>
-        </w:numPr>
-      </w:pPr>
-      <w:r>
-        <w:t>Sistema de comentários</w:t>
-      </w:r>
-    </w:p>
-    <w:p>
-      <w:pPr>
-        <w:numPr>
-          <w:ilvl w:val="0"/>
-          <w:numId w:val="5"/>
-        </w:numPr>
-      </w:pPr>
-      <w:r>
-        <w:t>Estrutura do feed do clube</w:t>
+          <w:numId w:val="2"/>
+        </w:numPr>
+      </w:pPr>
+      <w:r>
+        <w:t>Implementação do módulo de Encontros</w:t>
+      </w:r>
+    </w:p>
+    <w:p>
+      <w:pPr>
+        <w:numPr>
+          <w:ilvl w:val="0"/>
+          <w:numId w:val="2"/>
+        </w:numPr>
+      </w:pPr>
+      <w:r>
+        <w:t>Criação e listagem de encontros por clube</w:t>
+      </w:r>
+    </w:p>
+    <w:p>
+      <w:pPr>
+        <w:numPr>
+          <w:ilvl w:val="0"/>
+          <w:numId w:val="2"/>
+        </w:numPr>
+      </w:pPr>
+      <w:r>
+        <w:t>Implementação do sistema de comentários simples</w:t>
+      </w:r>
+    </w:p>
+    <w:p>
+      <w:pPr>
+        <w:numPr>
+          <w:ilvl w:val="0"/>
+          <w:numId w:val="2"/>
+        </w:numPr>
+      </w:pPr>
+      <w:r>
+        <w:t>Integração entre livros, encontros e comentários</w:t>
       </w:r>
     </w:p>
     <w:p>
@@ -726,7 +757,6 @@
         <w:pStyle w:val="Ttulo2"/>
       </w:pPr>
       <w:r>
-        <w:lastRenderedPageBreak/>
         <w:t>Semana 14 (18/05 – 24/05)</w:t>
       </w:r>
     </w:p>
@@ -734,55 +764,57 @@
       <w:pPr>
         <w:numPr>
           <w:ilvl w:val="0"/>
-          <w:numId w:val="6"/>
-        </w:numPr>
-      </w:pPr>
-      <w:r>
-        <w:t>Implementação de enquetes internas</w:t>
-      </w:r>
-    </w:p>
-    <w:p>
-      <w:pPr>
-        <w:numPr>
-          <w:ilvl w:val="0"/>
-          <w:numId w:val="6"/>
-        </w:numPr>
-      </w:pPr>
-      <w:r>
-        <w:t>Implementação de eventos do clube</w:t>
-      </w:r>
-    </w:p>
-    <w:p>
-      <w:pPr>
-        <w:numPr>
-          <w:ilvl w:val="0"/>
-          <w:numId w:val="6"/>
+          <w:numId w:val="2"/>
+        </w:numPr>
+      </w:pPr>
+      <w:r>
+        <w:t>Ajustes gerais das funcionalidades implementadas</w:t>
+      </w:r>
+    </w:p>
+    <w:p>
+      <w:pPr>
+        <w:numPr>
+          <w:ilvl w:val="0"/>
+          <w:numId w:val="2"/>
+        </w:numPr>
+      </w:pPr>
+      <w:r>
+        <w:t>Validação dos fluxos principais do MVP</w:t>
+      </w:r>
+    </w:p>
+    <w:p>
+      <w:pPr>
+        <w:numPr>
+          <w:ilvl w:val="0"/>
+          <w:numId w:val="2"/>
         </w:numPr>
       </w:pPr>
       <w:r>
         <w:t>Ajustes de interface e experiência do usuário</w:t>
       </w:r>
     </w:p>
+    <w:p>
+      <w:pPr>
+        <w:numPr>
+          <w:ilvl w:val="0"/>
+          <w:numId w:val="2"/>
+        </w:numPr>
+      </w:pPr>
+      <w:r>
+        <w:t>Refinamentos de permissões, mensagens e estados de tela</w:t>
+      </w:r>
+    </w:p>
     <w:p/>
     <w:p>
       <w:pPr>
         <w:pStyle w:val="Ttulo1"/>
       </w:pPr>
       <w:r>
-        <w:t xml:space="preserve">Fase 5 – Testes, Ajustes e </w:t>
-      </w:r>
-      <w:proofErr w:type="spellStart"/>
-      <w:r>
-        <w:t>Deploy</w:t>
-      </w:r>
-      <w:proofErr w:type="spellEnd"/>
-    </w:p>
-    <w:p>
-      <w:r>
-        <w:rPr>
-          <w:b/>
-          <w:bCs/>
-        </w:rPr>
+        <w:t>Fase 5 – Testes, Ajustes e Deploy</w:t>
+      </w:r>
+    </w:p>
+    <w:p>
+      <w:r>
         <w:t>Período: 25/05/2026 a 07/06/2026</w:t>
       </w:r>
     </w:p>
@@ -798,7 +830,7 @@
       <w:pPr>
         <w:numPr>
           <w:ilvl w:val="0"/>
-          <w:numId w:val="7"/>
+          <w:numId w:val="2"/>
         </w:numPr>
       </w:pPr>
       <w:r>
@@ -809,7 +841,7 @@
       <w:pPr>
         <w:numPr>
           <w:ilvl w:val="0"/>
-          <w:numId w:val="7"/>
+          <w:numId w:val="2"/>
         </w:numPr>
       </w:pPr>
       <w:r>
@@ -820,7 +852,7 @@
       <w:pPr>
         <w:numPr>
           <w:ilvl w:val="0"/>
-          <w:numId w:val="7"/>
+          <w:numId w:val="2"/>
         </w:numPr>
       </w:pPr>
       <w:r>
@@ -829,6 +861,17 @@
     </w:p>
     <w:p>
       <w:pPr>
+        <w:numPr>
+          <w:ilvl w:val="0"/>
+          <w:numId w:val="2"/>
+        </w:numPr>
+      </w:pPr>
+      <w:r>
+        <w:t>Correções de bugs identificados</w:t>
+      </w:r>
+    </w:p>
+    <w:p>
+      <w:pPr>
         <w:pStyle w:val="Ttulo2"/>
       </w:pPr>
       <w:r>
@@ -839,23 +882,18 @@
       <w:pPr>
         <w:numPr>
           <w:ilvl w:val="0"/>
-          <w:numId w:val="8"/>
-        </w:numPr>
-      </w:pPr>
-      <w:r>
-        <w:t xml:space="preserve">Preparação para </w:t>
-      </w:r>
-      <w:proofErr w:type="spellStart"/>
-      <w:r>
-        <w:t>deploy</w:t>
-      </w:r>
-      <w:proofErr w:type="spellEnd"/>
-    </w:p>
-    <w:p>
-      <w:pPr>
-        <w:numPr>
-          <w:ilvl w:val="0"/>
-          <w:numId w:val="8"/>
+          <w:numId w:val="2"/>
+        </w:numPr>
+      </w:pPr>
+      <w:r>
+        <w:t>Preparação para deploy</w:t>
+      </w:r>
+    </w:p>
+    <w:p>
+      <w:pPr>
+        <w:numPr>
+          <w:ilvl w:val="0"/>
+          <w:numId w:val="2"/>
         </w:numPr>
       </w:pPr>
       <w:r>
@@ -866,11 +904,22 @@
       <w:pPr>
         <w:numPr>
           <w:ilvl w:val="0"/>
-          <w:numId w:val="8"/>
+          <w:numId w:val="2"/>
         </w:numPr>
       </w:pPr>
       <w:r>
         <w:t>Documentação técnica do projeto</w:t>
+      </w:r>
+    </w:p>
+    <w:p>
+      <w:pPr>
+        <w:numPr>
+          <w:ilvl w:val="0"/>
+          <w:numId w:val="2"/>
+        </w:numPr>
+      </w:pPr>
+      <w:r>
+        <w:t>Revisão final do MVP e organização da entrega</w:t>
       </w:r>
     </w:p>
     <w:p/>

</xml_diff>